<commit_message>
Finished first draft of the background
</commit_message>
<xml_diff>
--- a/Database.docx
+++ b/Database.docx
@@ -4,7 +4,7 @@
   <w:body>
     <w:p>
       <w:pPr>
-        <w:pStyle w:val="Heading1"/>
+        <w:pStyle w:val="Titolo1"/>
       </w:pPr>
       <w:r>
         <w:t>Persistenza dei Dati e Database Relazionali</w:t>
@@ -12,10 +12,10 @@
     </w:p>
     <w:p>
       <w:r>
-        <w:t>Le attività di raccolta, organizzazione e conservazione dei dati costituiscono uno dei principali compiti dei sistemi informatici. La gestione dei dati richiede l’utilizzo di infrastrutture dedicate e modelli progettati appositamente per garantire l’utilizzo del</w:t>
-      </w:r>
-      <w:r>
-        <w:t xml:space="preserve">l’archiviazione a lungo termine e alla sicurezza, integrità e coerenza di tali dati. </w:t>
+        <w:t>I sistemi di basi di dati (DBMS) rappresentano l'infrastruttura standard per l'archiviazione strutturata, la persistenza e il recupero delle informazioni nei moderni sistemi software</w:t>
+      </w:r>
+      <w:r>
+        <w:t>.</w:t>
       </w:r>
     </w:p>
     <w:p>
@@ -23,23 +23,27 @@
         <w:t xml:space="preserve">Il paradigma principale per l'organizzazione logica dei dati è il modello relazionale, introdotto formalmente da Edgar F. Codd nel 1970. </w:t>
       </w:r>
       <w:r>
-        <w:t xml:space="preserve">Questo modello a differenza dei modelli </w:t>
-      </w:r>
-      <w:r>
-        <w:t>gerarchici o reticolari precedenti, si basa sulla teoria matematica degli insiemi e sull'algebra relazionale. In questo modello, le informazioni sono organizzate in tabelle, chiamate "relazioni”, composte da righe, o "</w:t>
-      </w:r>
-      <w:proofErr w:type="spellStart"/>
-      <w:r>
-        <w:t>tuple</w:t>
-      </w:r>
-      <w:proofErr w:type="spellEnd"/>
-      <w:r>
-        <w:t>", che rappresentano singole istanze di un'entità, e colonne, o "attributi", che descrivono le proprietà di quell'entità. La solidità matematica del modello consente di interrogare e manipolare i dati in modo dichiarativo, garantendo l'indipendenza tra la logica di estrazione e i processi di memorizzazione di basso livello.</w:t>
+        <w:t>Questo modello</w:t>
+      </w:r>
+      <w:r>
+        <w:t>,</w:t>
+      </w:r>
+      <w:r>
+        <w:t xml:space="preserve"> a differenza dei modelli </w:t>
+      </w:r>
+      <w:r>
+        <w:t xml:space="preserve">gerarchici o reticolari precedenti, si basa sulla teoria matematica degli insiemi e sull'algebra relazionale. In questo modello, le informazioni sono organizzate in tabelle, chiamate "relazioni”, composte da righe, o "tuple", che rappresentano singole istanze di un'entità, e colonne, o "attributi", che descrivono le proprietà di quell'entità. La solidità matematica del modello consente di interrogare e manipolare i dati in modo dichiarativo, </w:t>
+      </w:r>
+      <w:r>
+        <w:t>separando la logica applicativa dalle modalità fisiche di memorizzazione delle informazioni. Tale separazione permette una maggiore indipendenza tra i processi di sviluppo software e le tecniche di gestione dello spazio di archiviazione.</w:t>
+      </w:r>
+      <w:r>
+        <w:t xml:space="preserve"> </w:t>
       </w:r>
     </w:p>
     <w:p>
       <w:pPr>
-        <w:pStyle w:val="Heading2"/>
+        <w:pStyle w:val="Titolo2"/>
       </w:pPr>
       <w:r>
         <w:t xml:space="preserve">Sistemi di Gestione di Database </w:t>
@@ -47,10 +51,13 @@
     </w:p>
     <w:p>
       <w:r>
-        <w:t xml:space="preserve">La gestione del modello relazionale viene rilegato ai </w:t>
-      </w:r>
-      <w:r>
-        <w:t>sistemi di gestione di basi di dati (DBMS)</w:t>
+        <w:t xml:space="preserve">La gestione del modello relazionale è </w:t>
+      </w:r>
+      <w:r>
+        <w:t>affidata</w:t>
+      </w:r>
+      <w:r>
+        <w:t xml:space="preserve"> ai sistemi di gestione di basi di dati (DBMS)</w:t>
       </w:r>
       <w:r>
         <w:t xml:space="preserve">. </w:t>
@@ -68,19 +75,25 @@
         <w:t xml:space="preserve">progettati per gestire collezioni di dati, </w:t>
       </w:r>
       <w:r>
-        <w:t xml:space="preserve">garantendo che tali dati siano condivisi, persistenti, e mantenuti con elevati standard di affidabilità e </w:t>
-      </w:r>
-      <w:r>
-        <w:t>privacy. Queste collezioni di dati possono essere di dimensioni molto grandi e quindi bisogna gestire l’</w:t>
-      </w:r>
-      <w:r>
-        <w:t>allocazione</w:t>
+        <w:t xml:space="preserve">garantendo che tali dati siano condivisi, persistenti e mantenuti con elevati standard di affidabilità e </w:t>
+      </w:r>
+      <w:r>
+        <w:t xml:space="preserve">privacy. Queste collezioni di dati possono essere di dimensioni molto grandi </w:t>
+      </w:r>
+      <w:r>
+        <w:t>rendendo necessaria la gestione dell'allocazione</w:t>
       </w:r>
       <w:r>
         <w:t xml:space="preserve"> dei dati in memorie secondarie. </w:t>
       </w:r>
       <w:r>
-        <w:t>Il DBMS garantisce la condivisione tra molteplici utenti e applicazioni, eliminando la ridondanza strutturale e prevendendo il rischio di inconsistenze l</w:t>
+        <w:t xml:space="preserve">Il DBMS garantisce la condivisione tra molteplici utenti e applicazioni, eliminando la ridondanza strutturale e </w:t>
+      </w:r>
+      <w:r>
+        <w:t>prevenendo</w:t>
+      </w:r>
+      <w:r>
+        <w:t xml:space="preserve"> il rischio di inconsistenze l</w:t>
       </w:r>
       <w:r>
         <w:t xml:space="preserve">ogiche derivanti dalla replicazione non controllata. </w:t>
@@ -125,237 +138,271 @@
         <w:t xml:space="preserve">pure </w:t>
       </w:r>
       <w:r>
-        <w:t>in caso di guasti hardware o software (backup e recovery), e di privatezza tramite meccanismi di autorizzazione che abilitano gli utenti solo a specifiche azioni</w:t>
+        <w:t xml:space="preserve">in caso di guasti hardware o software (backup e recovery), e di </w:t>
+      </w:r>
+      <w:r>
+        <w:t>sicurezza degli accessi</w:t>
+      </w:r>
+      <w:r>
+        <w:t xml:space="preserve"> </w:t>
+      </w:r>
+      <w:r>
+        <w:t>tramite meccanismi di autorizzazione che abilitano gli utenti solo a specifiche azioni</w:t>
       </w:r>
       <w:r>
         <w:t>.</w:t>
       </w:r>
-    </w:p>
-    <w:p>
-      <w:r>
-        <w:t>L'architettura interna di un DBMS relazionale (RDBMS) si compone di vari sottosistemi: il Query Processor, che analizza, ottimizza ed esegue le interrogazioni formulate nel linguaggio standard SQL (</w:t>
-      </w:r>
-      <w:proofErr w:type="spellStart"/>
-      <w:r>
-        <w:t>Structured</w:t>
-      </w:r>
-      <w:proofErr w:type="spellEnd"/>
-      <w:r>
-        <w:t xml:space="preserve"> Query Language); </w:t>
+      <w:r>
+        <w:t xml:space="preserve"> </w:t>
+      </w:r>
+      <w:r>
+        <w:t xml:space="preserve"> </w:t>
+      </w:r>
+    </w:p>
+    <w:p>
+      <w:r>
+        <w:t xml:space="preserve">L'architettura interna di un DBMS relazionale (RDBMS) si compone di vari sottosistemi: il Query Processor, che analizza, ottimizza ed esegue le interrogazioni formulate nel linguaggio standard SQL (Structured Query Language); </w:t>
       </w:r>
       <w:r>
         <w:t>lo</w:t>
       </w:r>
       <w:r>
-        <w:t xml:space="preserve"> Storage Manager, che interfaccia il motore logico con il file system del sistema operativo per l'allocazione dello spazio su disco; e il </w:t>
-      </w:r>
-      <w:proofErr w:type="spellStart"/>
-      <w:r>
-        <w:t>Transaction</w:t>
-      </w:r>
-      <w:proofErr w:type="spellEnd"/>
-      <w:r>
-        <w:t xml:space="preserve"> Manager, responsabile della sicurezza e della concorrenza. L'impiego di un DBMS solleva lo sviluppatore dall'onere di gestire l'accesso a basso livello ai file, la frammentazione dei dischi e le collisioni derivanti dall'accesso simultaneo ai dati da parte di molteplici processi.</w:t>
+        <w:t xml:space="preserve"> Storage Manager, che interfaccia il motore logico con il file system del sistema operativo per l'allocazione dello spazio su disco; e il Transaction Manager, responsabile della sicurezza e della concorrenza. L'impiego di un DBMS solleva lo sviluppatore dall'onere di gestire l'accesso a basso livello ai file, la frammentazione dei dischi e le collisioni derivanti dall'accesso simultaneo ai dati da parte di molteplici processi.</w:t>
       </w:r>
     </w:p>
     <w:p/>
     <w:p/>
     <w:p>
       <w:pPr>
-        <w:pStyle w:val="Heading2"/>
+        <w:pStyle w:val="Titolo2"/>
         <w:rPr>
-          <w:rStyle w:val="Heading2Char"/>
+          <w:rStyle w:val="Titolo2Carattere"/>
         </w:rPr>
       </w:pPr>
-      <w:proofErr w:type="spellStart"/>
       <w:r>
         <w:rPr>
-          <w:rStyle w:val="Heading2Char"/>
+          <w:rStyle w:val="Titolo2Carattere"/>
         </w:rPr>
-        <w:t>Eloquent</w:t>
-      </w:r>
-      <w:proofErr w:type="spellEnd"/>
-      <w:r>
+        <w:t>Eloquent ORM</w:t>
+      </w:r>
+    </w:p>
+    <w:p>
+      <w:pPr>
         <w:rPr>
-          <w:rStyle w:val="Heading2Char"/>
+          <w:u w:val="single"/>
         </w:rPr>
-        <w:t xml:space="preserve"> ORM</w:t>
-      </w:r>
-    </w:p>
-    <w:p>
+      </w:pPr>
       <w:r>
         <w:t>L’Object-</w:t>
       </w:r>
-      <w:proofErr w:type="spellStart"/>
-      <w:r>
-        <w:t>Realtional</w:t>
-      </w:r>
-      <w:proofErr w:type="spellEnd"/>
+      <w:r>
+        <w:t>Re</w:t>
+      </w:r>
+      <w:r>
+        <w:t>la</w:t>
+      </w:r>
+      <w:r>
+        <w:t>tional</w:t>
+      </w:r>
       <w:r>
         <w:t xml:space="preserve"> Mapping (ORM) è un para</w:t>
       </w:r>
       <w:r>
         <w:t xml:space="preserve">digma architetturale ideato per </w:t>
       </w:r>
-      <w:proofErr w:type="spellStart"/>
-      <w:r>
-        <w:t>colmarel’incongruenza</w:t>
-      </w:r>
-      <w:proofErr w:type="spellEnd"/>
-      <w:r>
-        <w:t xml:space="preserve"> strutturale e logica che esiste fra la programmazione orientata agli oggetti, come PHP e i RDBMS. </w:t>
-      </w:r>
-      <w:proofErr w:type="spellStart"/>
-      <w:r>
-        <w:t>Eloquent</w:t>
-      </w:r>
-      <w:proofErr w:type="spellEnd"/>
-      <w:r>
-        <w:t xml:space="preserve"> è la soluzione ideata da Laravel, che integra il paradigma ORM. Ogni tabella del database viene associata ad una classe Model, impiegata per incapsulare la logica di acceso e manipolazione dei record corrispondenti.</w:t>
-      </w:r>
-    </w:p>
-    <w:p>
-      <w:r>
-        <w:t xml:space="preserve">L'architettura di </w:t>
-      </w:r>
-      <w:proofErr w:type="spellStart"/>
-      <w:r>
-        <w:t>Eloquent</w:t>
-      </w:r>
-      <w:proofErr w:type="spellEnd"/>
-      <w:r>
-        <w:t xml:space="preserve"> si basa sul principio di "convenzione rispetto alla configurazione": se lo sviluppatore non specifica esplicitamente il nome della tabella di riferimento, il sistema lo deduce automaticamente convertendo il nome della classe del modello dal formato singolare al plurale in </w:t>
-      </w:r>
-      <w:proofErr w:type="spellStart"/>
+      <w:r>
+        <w:t>colm</w:t>
+      </w:r>
+      <w:r>
+        <w:t>are</w:t>
+      </w:r>
+      <w:r>
+        <w:t xml:space="preserve"> </w:t>
+      </w:r>
+      <w:r>
+        <w:t xml:space="preserve">l’incongruenza strutturale e logica che esiste fra la programmazione orientata agli oggetti, come PHP e i RDBMS. </w:t>
+      </w:r>
+      <w:r>
+        <w:t>Eloquent è la soluzione ORM integrata in Laravel, sviluppata secondo il design pattern Active Record. In conformità a questo pattern, ogni tabella del database viene associata a una classe Model, le cui istanze incapsulano simultaneamente i dati della singola tupla e la logica necessaria per l'accesso e la manipolazione del record corrispondente</w:t>
+      </w:r>
+      <w:r>
+        <w:t>.</w:t>
+      </w:r>
+      <w:r>
+        <w:t xml:space="preserve"> </w:t>
+      </w:r>
+    </w:p>
+    <w:p>
+      <w:r>
+        <w:t xml:space="preserve">L'architettura di Eloquent si basa sul principio di "convenzione rispetto alla configurazione": se lo sviluppatore non specifica esplicitamente il nome della tabella di riferimento, il sistema lo deduce </w:t>
+      </w:r>
       <w:r>
         <w:lastRenderedPageBreak/>
-        <w:t>snake_case</w:t>
-      </w:r>
-      <w:proofErr w:type="spellEnd"/>
-      <w:r>
-        <w:t xml:space="preserve">. Allo stesso modo, </w:t>
-      </w:r>
-      <w:proofErr w:type="spellStart"/>
-      <w:r>
-        <w:t>Eloquent</w:t>
-      </w:r>
-      <w:proofErr w:type="spellEnd"/>
-      <w:r>
-        <w:t xml:space="preserve"> assume sempre la presenza di una chiave primaria intera e </w:t>
-      </w:r>
-      <w:proofErr w:type="spellStart"/>
-      <w:r>
-        <w:t>autoincrementante</w:t>
-      </w:r>
-      <w:proofErr w:type="spellEnd"/>
-      <w:r>
-        <w:t xml:space="preserve"> chiamata id e di colonne </w:t>
-      </w:r>
-      <w:proofErr w:type="spellStart"/>
-      <w:r>
-        <w:t>timestamp</w:t>
-      </w:r>
-      <w:proofErr w:type="spellEnd"/>
-      <w:r>
-        <w:t xml:space="preserve">, </w:t>
-      </w:r>
-      <w:proofErr w:type="spellStart"/>
-      <w:r>
-        <w:t>created_at</w:t>
-      </w:r>
-      <w:proofErr w:type="spellEnd"/>
-      <w:r>
-        <w:t xml:space="preserve"> e </w:t>
-      </w:r>
-      <w:proofErr w:type="spellStart"/>
-      <w:r>
-        <w:t>updated_at</w:t>
-      </w:r>
-      <w:proofErr w:type="spellEnd"/>
-      <w:r>
-        <w:t>, che l'ORM gestisce automaticamente durante le operazioni di inserimento e aggiornamento.</w:t>
-      </w:r>
-    </w:p>
-    <w:p>
-      <w:proofErr w:type="gramStart"/>
-      <w:r>
-        <w:t>Inoltre</w:t>
-      </w:r>
-      <w:proofErr w:type="gramEnd"/>
+        <w:t>automaticamente convertendo il nome della classe del modello dal formato singolare al plurale in snake_case. Allo stesso modo, Eloquent assume sempre la presenza di una chiave primaria intera e autoincrementante chiamata id e di colonne timestamp, created_at e updated_at, che l'ORM gestisce automaticamente durante le operazioni di inserimento e aggiornamento.</w:t>
+      </w:r>
+    </w:p>
+    <w:p>
+      <w:r>
+        <w:t>Inoltre,</w:t>
+      </w:r>
+      <w:r>
+        <w:t xml:space="preserve"> Eloquent astrae le interazioni tra le tabelle del database implementandole come metodi all'interno delle classi modello. Secondo la documentazione tecnica, il sistema gestisce automaticamente le relazioni standard, come quelle uno-a-uno</w:t>
+      </w:r>
+      <w:r>
+        <w:t xml:space="preserve"> (</w:t>
+      </w:r>
+      <w:r>
+        <w:t>hasOne</w:t>
+      </w:r>
+      <w:r>
+        <w:t>)</w:t>
+      </w:r>
+      <w:r>
+        <w:t xml:space="preserve"> e uno-a-molti</w:t>
+      </w:r>
+      <w:r>
+        <w:t xml:space="preserve"> (hasMany)</w:t>
+      </w:r>
+      <w:r>
+        <w:t>, oltre alle associazioni molti-a-molti, manipolando le tabelle intermedie senza richiedere l'intervento diretto dello sviluppatore</w:t>
+      </w:r>
+      <w:r>
+        <w:tab/>
+      </w:r>
+      <w:r>
+        <w:t>.</w:t>
+      </w:r>
       <w:r>
         <w:t xml:space="preserve"> </w:t>
       </w:r>
-      <w:proofErr w:type="spellStart"/>
-      <w:r>
-        <w:t>Eloquent</w:t>
-      </w:r>
-      <w:proofErr w:type="spellEnd"/>
-      <w:r>
-        <w:t xml:space="preserve"> astrae le interazioni tra le tabelle del database implementandole come metodi all'interno delle classi modello. Secondo la documentazione tecnica, il sistema gestisce automaticamente le relazioni standard, come quelle uno-a-uno</w:t>
-      </w:r>
-      <w:r>
-        <w:t xml:space="preserve"> (</w:t>
-      </w:r>
-      <w:proofErr w:type="spellStart"/>
-      <w:r>
-        <w:t>belongsTo</w:t>
-      </w:r>
-      <w:proofErr w:type="spellEnd"/>
-      <w:r>
-        <w:t>)</w:t>
-      </w:r>
-      <w:r>
-        <w:t xml:space="preserve"> e uno-a-molti</w:t>
-      </w:r>
-      <w:r>
-        <w:t xml:space="preserve"> (</w:t>
-      </w:r>
-      <w:proofErr w:type="spellStart"/>
-      <w:r>
-        <w:t>hasMany</w:t>
-      </w:r>
-      <w:proofErr w:type="spellEnd"/>
-      <w:r>
-        <w:t>)</w:t>
-      </w:r>
-      <w:r>
-        <w:t>, oltre alle associazioni molti-a-molti, manipolando le tabelle intermedie senza richiedere l'intervento diretto dello sviluppatore.</w:t>
-      </w:r>
     </w:p>
     <w:p/>
     <w:p>
       <w:pPr>
-        <w:pStyle w:val="Heading2"/>
+        <w:pStyle w:val="Titolo2"/>
       </w:pPr>
-      <w:proofErr w:type="spellStart"/>
       <w:r>
         <w:rPr>
-          <w:rStyle w:val="Heading2Char"/>
+          <w:rStyle w:val="Titolo2Carattere"/>
         </w:rPr>
-        <w:t>Versionamento</w:t>
-      </w:r>
-      <w:proofErr w:type="spellEnd"/>
+        <w:t>Versionamento del Database: Migrations</w:t>
+      </w:r>
+    </w:p>
+    <w:p>
+      <w:r>
+        <w:t xml:space="preserve">Accanto al sistema ORM Eloquent, Laravel mette a disposizione un meccanismo denominato </w:t>
+      </w:r>
       <w:r>
         <w:rPr>
-          <w:rStyle w:val="Heading2Char"/>
-        </w:rPr>
-        <w:t xml:space="preserve"> del Database: </w:t>
-      </w:r>
-      <w:proofErr w:type="spellStart"/>
-      <w:r>
-        <w:rPr>
-          <w:rStyle w:val="Heading2Char"/>
+          <w:i/>
+          <w:iCs/>
         </w:rPr>
         <w:t>Migrations</w:t>
       </w:r>
-      <w:proofErr w:type="spellEnd"/>
-    </w:p>
-    <w:p>
-      <w:r>
-        <w:t xml:space="preserve"> Concetto di evoluzione controllata dello schema senza intervento manuale su SQL.</w:t>
-      </w:r>
-    </w:p>
-    <w:p/>
+      <w:r>
+        <w:t>, progettato per gestire in modo strutturato e versionato l'evoluzione dello schema del database. Le migrations possono essere considerate come un sistema di controllo delle versioni per la struttura della base di dati, analogo ai sistemi di versionamento del codice sorgente, ma applicato alle tabelle, ai vincoli e agli attributi del database.</w:t>
+      </w:r>
+    </w:p>
+    <w:p>
+      <w:r>
+        <w:t>Tradizionalmente, le modifiche allo schema vengono effettuate mediante l'esecuzione diretta di istruzioni SQL sul database. Tale approccio può risultare problematico nei progetti collaborativi o in sistemi soggetti a frequenti evoluzioni, poiché rende complessa la sincronizzazione delle modifiche tra ambienti differenti e aumenta il rischio di inconsistenze strutturali. Le migrations affrontano questo problema rappresentando ogni modifica come una classe PHP che descrive esplicitamente le operazioni da applicare.</w:t>
+      </w:r>
+    </w:p>
+    <w:p>
+      <w:r>
+        <w:t xml:space="preserve">Ogni migration implementa generalmente due metodi principali: </w:t>
+      </w:r>
+      <w:r>
+        <w:rPr>
+          <w:i/>
+          <w:iCs/>
+        </w:rPr>
+        <w:t>up()</w:t>
+      </w:r>
+      <w:r>
+        <w:t xml:space="preserve"> e </w:t>
+      </w:r>
+      <w:r>
+        <w:rPr>
+          <w:i/>
+          <w:iCs/>
+        </w:rPr>
+        <w:t>down()</w:t>
+      </w:r>
+      <w:r>
+        <w:t xml:space="preserve">. Il metodo </w:t>
+      </w:r>
+      <w:r>
+        <w:rPr>
+          <w:i/>
+          <w:iCs/>
+        </w:rPr>
+        <w:t>up()</w:t>
+      </w:r>
+      <w:r>
+        <w:t xml:space="preserve"> definisce le modifiche da applicare allo schema, come la creazione di nuove tabelle, l'aggiunta di colonne o la definizione di relazioni; il metodo </w:t>
+      </w:r>
+      <w:r>
+        <w:rPr>
+          <w:i/>
+          <w:iCs/>
+        </w:rPr>
+        <w:t>down()</w:t>
+      </w:r>
+      <w:r>
+        <w:t xml:space="preserve"> descrive invece le operazioni inverse necessarie per annullare tali modifiche. Questo approccio consente di eseguire procedure di </w:t>
+      </w:r>
+      <w:r>
+        <w:rPr>
+          <w:i/>
+          <w:iCs/>
+        </w:rPr>
+        <w:t>rollback</w:t>
+      </w:r>
+      <w:r>
+        <w:t>, riportando il database a uno stato precedente nel caso di errori o necessità di ripristino.</w:t>
+      </w:r>
+    </w:p>
+    <w:p>
+      <w:r>
+        <w:t xml:space="preserve">Laravel mette inoltre a disposizione uno strato di astrazione chiamato </w:t>
+      </w:r>
+      <w:r>
+        <w:rPr>
+          <w:i/>
+          <w:iCs/>
+        </w:rPr>
+        <w:t>Schema Builder</w:t>
+      </w:r>
+      <w:r>
+        <w:t>, che consente di definire le strutture del database attraverso un'interfaccia orientata agli oggetti, riducendo la dipendenza da specifiche implementazioni SQL. In questo modo, lo sviluppatore può descrivere lo schema in maniera dichiarativa, mantenendo una maggiore portabilità tra differenti sistemi di gestione di database supportati dal framework.</w:t>
+      </w:r>
+    </w:p>
+    <w:p>
+      <w:pPr>
+        <w:rPr>
+          <w:u w:val="single"/>
+        </w:rPr>
+      </w:pPr>
+      <w:r>
+        <w:t>A completamento del versionamento strutturale, Laravel integra il meccanismo dei Seeders. Mentre le migrations operano a livello di definizione dello schema, i seeders gestiscono il popolamento automatizzato delle tabelle mediante dataset iniziali o di esempio. Tale meccanismo separa logicamente la struttura del database dai dati in esso contenuti, permettendo di automatizzare la configurazione dell'ambiente applicativo e garantendo la riproducibilità dello stato iniziale del sistema durante le fasi di sviluppo, testing e distribuzione</w:t>
+      </w:r>
+      <w:r>
+        <w:t>.</w:t>
+      </w:r>
+    </w:p>
+    <w:p>
+      <w:r>
+        <w:t>L'impiego delle migrations favorisce quindi la tracciabilità delle modifiche, la riproducibilità degli ambienti di sviluppo e produzione e una gestione più controllata dell'evoluzione del database durante l'intero ciclo di vita del software.</w:t>
+      </w:r>
+    </w:p>
+    <w:p>
+      <w:pPr>
+        <w:rPr>
+          <w:u w:val="single"/>
+        </w:rPr>
+      </w:pPr>
+    </w:p>
     <w:sectPr>
       <w:pgSz w:w="11906" w:h="16838"/>
       <w:pgMar w:top="1417" w:right="1134" w:bottom="1134" w:left="1134" w:header="708" w:footer="708" w:gutter="0"/>
@@ -763,15 +810,15 @@
     <w:lsdException w:name="Unresolved Mention" w:semiHidden="1" w:unhideWhenUsed="1"/>
     <w:lsdException w:name="Smart Link" w:semiHidden="1" w:unhideWhenUsed="1"/>
   </w:latentStyles>
-  <w:style w:type="paragraph" w:default="1" w:styleId="Normal">
+  <w:style w:type="paragraph" w:default="1" w:styleId="Normale">
     <w:name w:val="Normal"/>
     <w:qFormat/>
   </w:style>
-  <w:style w:type="paragraph" w:styleId="Heading1">
+  <w:style w:type="paragraph" w:styleId="Titolo1">
     <w:name w:val="heading 1"/>
-    <w:basedOn w:val="Normal"/>
-    <w:next w:val="Normal"/>
-    <w:link w:val="Heading1Char"/>
+    <w:basedOn w:val="Normale"/>
+    <w:next w:val="Normale"/>
+    <w:link w:val="Titolo1Carattere"/>
     <w:uiPriority w:val="9"/>
     <w:qFormat/>
     <w:rsid w:val="00933F9A"/>
@@ -788,11 +835,11 @@
       <w:szCs w:val="40"/>
     </w:rPr>
   </w:style>
-  <w:style w:type="paragraph" w:styleId="Heading2">
+  <w:style w:type="paragraph" w:styleId="Titolo2">
     <w:name w:val="heading 2"/>
-    <w:basedOn w:val="Normal"/>
-    <w:next w:val="Normal"/>
-    <w:link w:val="Heading2Char"/>
+    <w:basedOn w:val="Normale"/>
+    <w:next w:val="Normale"/>
+    <w:link w:val="Titolo2Carattere"/>
     <w:uiPriority w:val="9"/>
     <w:unhideWhenUsed/>
     <w:qFormat/>
@@ -810,11 +857,11 @@
       <w:szCs w:val="32"/>
     </w:rPr>
   </w:style>
-  <w:style w:type="paragraph" w:styleId="Heading3">
+  <w:style w:type="paragraph" w:styleId="Titolo3">
     <w:name w:val="heading 3"/>
-    <w:basedOn w:val="Normal"/>
-    <w:next w:val="Normal"/>
-    <w:link w:val="Heading3Char"/>
+    <w:basedOn w:val="Normale"/>
+    <w:next w:val="Normale"/>
+    <w:link w:val="Titolo3Carattere"/>
     <w:uiPriority w:val="9"/>
     <w:unhideWhenUsed/>
     <w:qFormat/>
@@ -832,11 +879,11 @@
       <w:szCs w:val="28"/>
     </w:rPr>
   </w:style>
-  <w:style w:type="paragraph" w:styleId="Heading4">
+  <w:style w:type="paragraph" w:styleId="Titolo4">
     <w:name w:val="heading 4"/>
-    <w:basedOn w:val="Normal"/>
-    <w:next w:val="Normal"/>
-    <w:link w:val="Heading4Char"/>
+    <w:basedOn w:val="Normale"/>
+    <w:next w:val="Normale"/>
+    <w:link w:val="Titolo4Carattere"/>
     <w:uiPriority w:val="9"/>
     <w:semiHidden/>
     <w:unhideWhenUsed/>
@@ -855,11 +902,11 @@
       <w:color w:val="2F5496" w:themeColor="accent1" w:themeShade="BF"/>
     </w:rPr>
   </w:style>
-  <w:style w:type="paragraph" w:styleId="Heading5">
+  <w:style w:type="paragraph" w:styleId="Titolo5">
     <w:name w:val="heading 5"/>
-    <w:basedOn w:val="Normal"/>
-    <w:next w:val="Normal"/>
-    <w:link w:val="Heading5Char"/>
+    <w:basedOn w:val="Normale"/>
+    <w:next w:val="Normale"/>
+    <w:link w:val="Titolo5Carattere"/>
     <w:uiPriority w:val="9"/>
     <w:semiHidden/>
     <w:unhideWhenUsed/>
@@ -876,11 +923,11 @@
       <w:color w:val="2F5496" w:themeColor="accent1" w:themeShade="BF"/>
     </w:rPr>
   </w:style>
-  <w:style w:type="paragraph" w:styleId="Heading6">
+  <w:style w:type="paragraph" w:styleId="Titolo6">
     <w:name w:val="heading 6"/>
-    <w:basedOn w:val="Normal"/>
-    <w:next w:val="Normal"/>
-    <w:link w:val="Heading6Char"/>
+    <w:basedOn w:val="Normale"/>
+    <w:next w:val="Normale"/>
+    <w:link w:val="Titolo6Carattere"/>
     <w:uiPriority w:val="9"/>
     <w:semiHidden/>
     <w:unhideWhenUsed/>
@@ -899,11 +946,11 @@
       <w:color w:val="595959" w:themeColor="text1" w:themeTint="A6"/>
     </w:rPr>
   </w:style>
-  <w:style w:type="paragraph" w:styleId="Heading7">
+  <w:style w:type="paragraph" w:styleId="Titolo7">
     <w:name w:val="heading 7"/>
-    <w:basedOn w:val="Normal"/>
-    <w:next w:val="Normal"/>
-    <w:link w:val="Heading7Char"/>
+    <w:basedOn w:val="Normale"/>
+    <w:next w:val="Normale"/>
+    <w:link w:val="Titolo7Carattere"/>
     <w:uiPriority w:val="9"/>
     <w:semiHidden/>
     <w:unhideWhenUsed/>
@@ -920,11 +967,11 @@
       <w:color w:val="595959" w:themeColor="text1" w:themeTint="A6"/>
     </w:rPr>
   </w:style>
-  <w:style w:type="paragraph" w:styleId="Heading8">
+  <w:style w:type="paragraph" w:styleId="Titolo8">
     <w:name w:val="heading 8"/>
-    <w:basedOn w:val="Normal"/>
-    <w:next w:val="Normal"/>
-    <w:link w:val="Heading8Char"/>
+    <w:basedOn w:val="Normale"/>
+    <w:next w:val="Normale"/>
+    <w:link w:val="Titolo8Carattere"/>
     <w:uiPriority w:val="9"/>
     <w:semiHidden/>
     <w:unhideWhenUsed/>
@@ -943,11 +990,11 @@
       <w:color w:val="272727" w:themeColor="text1" w:themeTint="D8"/>
     </w:rPr>
   </w:style>
-  <w:style w:type="paragraph" w:styleId="Heading9">
+  <w:style w:type="paragraph" w:styleId="Titolo9">
     <w:name w:val="heading 9"/>
-    <w:basedOn w:val="Normal"/>
-    <w:next w:val="Normal"/>
-    <w:link w:val="Heading9Char"/>
+    <w:basedOn w:val="Normale"/>
+    <w:next w:val="Normale"/>
+    <w:link w:val="Titolo9Carattere"/>
     <w:uiPriority w:val="9"/>
     <w:semiHidden/>
     <w:unhideWhenUsed/>
@@ -964,12 +1011,12 @@
       <w:color w:val="272727" w:themeColor="text1" w:themeTint="D8"/>
     </w:rPr>
   </w:style>
-  <w:style w:type="character" w:default="1" w:styleId="DefaultParagraphFont">
+  <w:style w:type="character" w:default="1" w:styleId="Carpredefinitoparagrafo">
     <w:name w:val="Default Paragraph Font"/>
     <w:uiPriority w:val="1"/>
     <w:unhideWhenUsed/>
   </w:style>
-  <w:style w:type="table" w:default="1" w:styleId="TableNormal">
+  <w:style w:type="table" w:default="1" w:styleId="Tabellanormale">
     <w:name w:val="Normal Table"/>
     <w:uiPriority w:val="99"/>
     <w:semiHidden/>
@@ -984,16 +1031,16 @@
       </w:tblCellMar>
     </w:tblPr>
   </w:style>
-  <w:style w:type="numbering" w:default="1" w:styleId="NoList">
+  <w:style w:type="numbering" w:default="1" w:styleId="Nessunelenco">
     <w:name w:val="No List"/>
     <w:uiPriority w:val="99"/>
     <w:semiHidden/>
     <w:unhideWhenUsed/>
   </w:style>
-  <w:style w:type="character" w:customStyle="1" w:styleId="Heading1Char">
-    <w:name w:val="Heading 1 Char"/>
-    <w:basedOn w:val="DefaultParagraphFont"/>
-    <w:link w:val="Heading1"/>
+  <w:style w:type="character" w:customStyle="1" w:styleId="Titolo1Carattere">
+    <w:name w:val="Titolo 1 Carattere"/>
+    <w:basedOn w:val="Carpredefinitoparagrafo"/>
+    <w:link w:val="Titolo1"/>
     <w:uiPriority w:val="9"/>
     <w:rsid w:val="00933F9A"/>
     <w:rPr>
@@ -1003,10 +1050,10 @@
       <w:szCs w:val="40"/>
     </w:rPr>
   </w:style>
-  <w:style w:type="character" w:customStyle="1" w:styleId="Heading2Char">
-    <w:name w:val="Heading 2 Char"/>
-    <w:basedOn w:val="DefaultParagraphFont"/>
-    <w:link w:val="Heading2"/>
+  <w:style w:type="character" w:customStyle="1" w:styleId="Titolo2Carattere">
+    <w:name w:val="Titolo 2 Carattere"/>
+    <w:basedOn w:val="Carpredefinitoparagrafo"/>
+    <w:link w:val="Titolo2"/>
     <w:uiPriority w:val="9"/>
     <w:rsid w:val="00933F9A"/>
     <w:rPr>
@@ -1016,10 +1063,10 @@
       <w:szCs w:val="32"/>
     </w:rPr>
   </w:style>
-  <w:style w:type="character" w:customStyle="1" w:styleId="Heading3Char">
-    <w:name w:val="Heading 3 Char"/>
-    <w:basedOn w:val="DefaultParagraphFont"/>
-    <w:link w:val="Heading3"/>
+  <w:style w:type="character" w:customStyle="1" w:styleId="Titolo3Carattere">
+    <w:name w:val="Titolo 3 Carattere"/>
+    <w:basedOn w:val="Carpredefinitoparagrafo"/>
+    <w:link w:val="Titolo3"/>
     <w:uiPriority w:val="9"/>
     <w:rsid w:val="00933F9A"/>
     <w:rPr>
@@ -1029,10 +1076,10 @@
       <w:szCs w:val="28"/>
     </w:rPr>
   </w:style>
-  <w:style w:type="character" w:customStyle="1" w:styleId="Heading4Char">
-    <w:name w:val="Heading 4 Char"/>
-    <w:basedOn w:val="DefaultParagraphFont"/>
-    <w:link w:val="Heading4"/>
+  <w:style w:type="character" w:customStyle="1" w:styleId="Titolo4Carattere">
+    <w:name w:val="Titolo 4 Carattere"/>
+    <w:basedOn w:val="Carpredefinitoparagrafo"/>
+    <w:link w:val="Titolo4"/>
     <w:uiPriority w:val="9"/>
     <w:semiHidden/>
     <w:rsid w:val="00933F9A"/>
@@ -1043,10 +1090,10 @@
       <w:color w:val="2F5496" w:themeColor="accent1" w:themeShade="BF"/>
     </w:rPr>
   </w:style>
-  <w:style w:type="character" w:customStyle="1" w:styleId="Heading5Char">
-    <w:name w:val="Heading 5 Char"/>
-    <w:basedOn w:val="DefaultParagraphFont"/>
-    <w:link w:val="Heading5"/>
+  <w:style w:type="character" w:customStyle="1" w:styleId="Titolo5Carattere">
+    <w:name w:val="Titolo 5 Carattere"/>
+    <w:basedOn w:val="Carpredefinitoparagrafo"/>
+    <w:link w:val="Titolo5"/>
     <w:uiPriority w:val="9"/>
     <w:semiHidden/>
     <w:rsid w:val="00933F9A"/>
@@ -1055,10 +1102,10 @@
       <w:color w:val="2F5496" w:themeColor="accent1" w:themeShade="BF"/>
     </w:rPr>
   </w:style>
-  <w:style w:type="character" w:customStyle="1" w:styleId="Heading6Char">
-    <w:name w:val="Heading 6 Char"/>
-    <w:basedOn w:val="DefaultParagraphFont"/>
-    <w:link w:val="Heading6"/>
+  <w:style w:type="character" w:customStyle="1" w:styleId="Titolo6Carattere">
+    <w:name w:val="Titolo 6 Carattere"/>
+    <w:basedOn w:val="Carpredefinitoparagrafo"/>
+    <w:link w:val="Titolo6"/>
     <w:uiPriority w:val="9"/>
     <w:semiHidden/>
     <w:rsid w:val="00933F9A"/>
@@ -1069,10 +1116,10 @@
       <w:color w:val="595959" w:themeColor="text1" w:themeTint="A6"/>
     </w:rPr>
   </w:style>
-  <w:style w:type="character" w:customStyle="1" w:styleId="Heading7Char">
-    <w:name w:val="Heading 7 Char"/>
-    <w:basedOn w:val="DefaultParagraphFont"/>
-    <w:link w:val="Heading7"/>
+  <w:style w:type="character" w:customStyle="1" w:styleId="Titolo7Carattere">
+    <w:name w:val="Titolo 7 Carattere"/>
+    <w:basedOn w:val="Carpredefinitoparagrafo"/>
+    <w:link w:val="Titolo7"/>
     <w:uiPriority w:val="9"/>
     <w:semiHidden/>
     <w:rsid w:val="00933F9A"/>
@@ -1081,10 +1128,10 @@
       <w:color w:val="595959" w:themeColor="text1" w:themeTint="A6"/>
     </w:rPr>
   </w:style>
-  <w:style w:type="character" w:customStyle="1" w:styleId="Heading8Char">
-    <w:name w:val="Heading 8 Char"/>
-    <w:basedOn w:val="DefaultParagraphFont"/>
-    <w:link w:val="Heading8"/>
+  <w:style w:type="character" w:customStyle="1" w:styleId="Titolo8Carattere">
+    <w:name w:val="Titolo 8 Carattere"/>
+    <w:basedOn w:val="Carpredefinitoparagrafo"/>
+    <w:link w:val="Titolo8"/>
     <w:uiPriority w:val="9"/>
     <w:semiHidden/>
     <w:rsid w:val="00933F9A"/>
@@ -1095,10 +1142,10 @@
       <w:color w:val="272727" w:themeColor="text1" w:themeTint="D8"/>
     </w:rPr>
   </w:style>
-  <w:style w:type="character" w:customStyle="1" w:styleId="Heading9Char">
-    <w:name w:val="Heading 9 Char"/>
-    <w:basedOn w:val="DefaultParagraphFont"/>
-    <w:link w:val="Heading9"/>
+  <w:style w:type="character" w:customStyle="1" w:styleId="Titolo9Carattere">
+    <w:name w:val="Titolo 9 Carattere"/>
+    <w:basedOn w:val="Carpredefinitoparagrafo"/>
+    <w:link w:val="Titolo9"/>
     <w:uiPriority w:val="9"/>
     <w:semiHidden/>
     <w:rsid w:val="00933F9A"/>
@@ -1107,11 +1154,11 @@
       <w:color w:val="272727" w:themeColor="text1" w:themeTint="D8"/>
     </w:rPr>
   </w:style>
-  <w:style w:type="paragraph" w:styleId="Title">
+  <w:style w:type="paragraph" w:styleId="Titolo">
     <w:name w:val="Title"/>
-    <w:basedOn w:val="Normal"/>
-    <w:next w:val="Normal"/>
-    <w:link w:val="TitleChar"/>
+    <w:basedOn w:val="Normale"/>
+    <w:next w:val="Normale"/>
+    <w:link w:val="TitoloCarattere"/>
     <w:uiPriority w:val="10"/>
     <w:qFormat/>
     <w:rsid w:val="00933F9A"/>
@@ -1127,10 +1174,10 @@
       <w:szCs w:val="56"/>
     </w:rPr>
   </w:style>
-  <w:style w:type="character" w:customStyle="1" w:styleId="TitleChar">
-    <w:name w:val="Title Char"/>
-    <w:basedOn w:val="DefaultParagraphFont"/>
-    <w:link w:val="Title"/>
+  <w:style w:type="character" w:customStyle="1" w:styleId="TitoloCarattere">
+    <w:name w:val="Titolo Carattere"/>
+    <w:basedOn w:val="Carpredefinitoparagrafo"/>
+    <w:link w:val="Titolo"/>
     <w:uiPriority w:val="10"/>
     <w:rsid w:val="00933F9A"/>
     <w:rPr>
@@ -1141,11 +1188,11 @@
       <w:szCs w:val="56"/>
     </w:rPr>
   </w:style>
-  <w:style w:type="paragraph" w:styleId="Subtitle">
+  <w:style w:type="paragraph" w:styleId="Sottotitolo">
     <w:name w:val="Subtitle"/>
-    <w:basedOn w:val="Normal"/>
-    <w:next w:val="Normal"/>
-    <w:link w:val="SubtitleChar"/>
+    <w:basedOn w:val="Normale"/>
+    <w:next w:val="Normale"/>
+    <w:link w:val="SottotitoloCarattere"/>
     <w:uiPriority w:val="11"/>
     <w:qFormat/>
     <w:rsid w:val="00933F9A"/>
@@ -1162,10 +1209,10 @@
       <w:szCs w:val="28"/>
     </w:rPr>
   </w:style>
-  <w:style w:type="character" w:customStyle="1" w:styleId="SubtitleChar">
-    <w:name w:val="Subtitle Char"/>
-    <w:basedOn w:val="DefaultParagraphFont"/>
-    <w:link w:val="Subtitle"/>
+  <w:style w:type="character" w:customStyle="1" w:styleId="SottotitoloCarattere">
+    <w:name w:val="Sottotitolo Carattere"/>
+    <w:basedOn w:val="Carpredefinitoparagrafo"/>
+    <w:link w:val="Sottotitolo"/>
     <w:uiPriority w:val="11"/>
     <w:rsid w:val="00933F9A"/>
     <w:rPr>
@@ -1176,11 +1223,11 @@
       <w:szCs w:val="28"/>
     </w:rPr>
   </w:style>
-  <w:style w:type="paragraph" w:styleId="Quote">
+  <w:style w:type="paragraph" w:styleId="Citazione">
     <w:name w:val="Quote"/>
-    <w:basedOn w:val="Normal"/>
-    <w:next w:val="Normal"/>
-    <w:link w:val="QuoteChar"/>
+    <w:basedOn w:val="Normale"/>
+    <w:next w:val="Normale"/>
+    <w:link w:val="CitazioneCarattere"/>
     <w:uiPriority w:val="29"/>
     <w:qFormat/>
     <w:rsid w:val="00933F9A"/>
@@ -1194,10 +1241,10 @@
       <w:color w:val="404040" w:themeColor="text1" w:themeTint="BF"/>
     </w:rPr>
   </w:style>
-  <w:style w:type="character" w:customStyle="1" w:styleId="QuoteChar">
-    <w:name w:val="Quote Char"/>
-    <w:basedOn w:val="DefaultParagraphFont"/>
-    <w:link w:val="Quote"/>
+  <w:style w:type="character" w:customStyle="1" w:styleId="CitazioneCarattere">
+    <w:name w:val="Citazione Carattere"/>
+    <w:basedOn w:val="Carpredefinitoparagrafo"/>
+    <w:link w:val="Citazione"/>
     <w:uiPriority w:val="29"/>
     <w:rsid w:val="00933F9A"/>
     <w:rPr>
@@ -1206,9 +1253,9 @@
       <w:color w:val="404040" w:themeColor="text1" w:themeTint="BF"/>
     </w:rPr>
   </w:style>
-  <w:style w:type="paragraph" w:styleId="ListParagraph">
+  <w:style w:type="paragraph" w:styleId="Paragrafoelenco">
     <w:name w:val="List Paragraph"/>
-    <w:basedOn w:val="Normal"/>
+    <w:basedOn w:val="Normale"/>
     <w:uiPriority w:val="34"/>
     <w:qFormat/>
     <w:rsid w:val="00933F9A"/>
@@ -1217,9 +1264,9 @@
       <w:contextualSpacing/>
     </w:pPr>
   </w:style>
-  <w:style w:type="character" w:styleId="IntenseEmphasis">
+  <w:style w:type="character" w:styleId="Enfasiintensa">
     <w:name w:val="Intense Emphasis"/>
-    <w:basedOn w:val="DefaultParagraphFont"/>
+    <w:basedOn w:val="Carpredefinitoparagrafo"/>
     <w:uiPriority w:val="21"/>
     <w:qFormat/>
     <w:rsid w:val="00933F9A"/>
@@ -1229,11 +1276,11 @@
       <w:color w:val="2F5496" w:themeColor="accent1" w:themeShade="BF"/>
     </w:rPr>
   </w:style>
-  <w:style w:type="paragraph" w:styleId="IntenseQuote">
+  <w:style w:type="paragraph" w:styleId="Citazioneintensa">
     <w:name w:val="Intense Quote"/>
-    <w:basedOn w:val="Normal"/>
-    <w:next w:val="Normal"/>
-    <w:link w:val="IntenseQuoteChar"/>
+    <w:basedOn w:val="Normale"/>
+    <w:next w:val="Normale"/>
+    <w:link w:val="CitazioneintensaCarattere"/>
     <w:uiPriority w:val="30"/>
     <w:qFormat/>
     <w:rsid w:val="00933F9A"/>
@@ -1252,10 +1299,10 @@
       <w:color w:val="2F5496" w:themeColor="accent1" w:themeShade="BF"/>
     </w:rPr>
   </w:style>
-  <w:style w:type="character" w:customStyle="1" w:styleId="IntenseQuoteChar">
-    <w:name w:val="Intense Quote Char"/>
-    <w:basedOn w:val="DefaultParagraphFont"/>
-    <w:link w:val="IntenseQuote"/>
+  <w:style w:type="character" w:customStyle="1" w:styleId="CitazioneintensaCarattere">
+    <w:name w:val="Citazione intensa Carattere"/>
+    <w:basedOn w:val="Carpredefinitoparagrafo"/>
+    <w:link w:val="Citazioneintensa"/>
     <w:uiPriority w:val="30"/>
     <w:rsid w:val="00933F9A"/>
     <w:rPr>
@@ -1264,9 +1311,9 @@
       <w:color w:val="2F5496" w:themeColor="accent1" w:themeShade="BF"/>
     </w:rPr>
   </w:style>
-  <w:style w:type="character" w:styleId="IntenseReference">
+  <w:style w:type="character" w:styleId="Riferimentointenso">
     <w:name w:val="Intense Reference"/>
-    <w:basedOn w:val="DefaultParagraphFont"/>
+    <w:basedOn w:val="Carpredefinitoparagrafo"/>
     <w:uiPriority w:val="32"/>
     <w:qFormat/>
     <w:rsid w:val="00933F9A"/>

</xml_diff>